<commit_message>
Control de desvíos y cierre de riesgos del Sprint 2 (corte 23/09)
Actualiza el Gantt con las fechas reales, suma la carpeta del Sprint 1
como desvío fuera de la EDT, agrega lecciones aprendidas y registra el
cierre de cada riesgo con su evidencia. Quedan abiertos R4, R6 y R7.

Co-Authored-By: Claude Opus 5.5 <noreply@anthropic.com>
</commit_message>
<xml_diff>
--- a/docs/sprint-2/01_Diagrama_de_Gantt_y_Control_de_Desvios.docx
+++ b/docs/sprint-2/01_Diagrama_de_Gantt_y_Control_de_Desvios.docx
@@ -102,12 +102,8 @@
             <w:pPr>
               <w:spacing w:after="0"/>
             </w:pPr>
-            <w:r/>
             <w:r>
-              <w:rPr>
-                <w:b w:val="0"/>
-              </w:rPr>
-              <w:t>Sprint 2 — Semana 4 — Diagrama de Gantt y Control de Desvíos</w:t>
+              <w:t>Sprint 2 — Semana 5 — Diagrama de Gantt y Control de Desvíos (control de cierre)</w:t>
             </w:r>
           </w:p>
         </w:tc>
@@ -250,12 +246,8 @@
             <w:pPr>
               <w:spacing w:after="0"/>
             </w:pPr>
-            <w:r/>
             <w:r>
-              <w:rPr>
-                <w:b w:val="0"/>
-              </w:rPr>
-              <w:t>22 de septiembre de 2026</w:t>
+              <w:t>23 de septiembre de 2026</w:t>
             </w:r>
           </w:p>
         </w:tc>
@@ -335,7 +327,7 @@
         <w:t xml:space="preserve">Fecha de corte. </w:t>
       </w:r>
       <w:r>
-        <w:t>22 de septiembre de 2026 (lunes de la semana 5).</w:t>
+        <w:t>23 de septiembre de 2026 (miércoles de la semana 5). Esta versión es el control de cierre del Sprint 2, adelantado respecto de la semana 6 prevista. La versión anterior, con corte el 22/09, se conserva en el historial del repositorio.</w:t>
       </w:r>
     </w:p>
     <w:p>
@@ -376,7 +368,7 @@
       <w:r>
         <w:drawing>
           <wp:inline xmlns:a="http://schemas.openxmlformats.org/drawingml/2006/main" xmlns:pic="http://schemas.openxmlformats.org/drawingml/2006/picture">
-            <wp:extent cx="5943600" cy="4279392"/>
+            <wp:extent cx="5943600" cy="3459424"/>
             <wp:docPr id="1" name="Picture 1"/>
             <wp:cNvGraphicFramePr>
               <a:graphicFrameLocks noChangeAspect="1"/>
@@ -385,11 +377,11 @@
               <a:graphicData uri="http://schemas.openxmlformats.org/drawingml/2006/picture">
                 <pic:pic>
                   <pic:nvPicPr>
-                    <pic:cNvPr id="0" name="gantt.png"/>
+                    <pic:cNvPr id="0" name="01_Diagrama_de_Gantt.png"/>
                     <pic:cNvPicPr/>
                   </pic:nvPicPr>
                   <pic:blipFill>
-                    <a:blip r:embed="rId9"/>
+                    <a:blip r:embed="rId10"/>
                     <a:stretch>
                       <a:fillRect/>
                     </a:stretch>
@@ -397,7 +389,7 @@
                   <pic:spPr>
                     <a:xfrm>
                       <a:off x="0" y="0"/>
-                      <a:ext cx="5943600" cy="4279392"/>
+                      <a:ext cx="5943600" cy="3459424"/>
                     </a:xfrm>
                     <a:prstGeom prst="rect"/>
                   </pic:spPr>
@@ -1213,13 +1205,11 @@
               <w:spacing w:after="0"/>
               <w:jc w:val="center"/>
             </w:pPr>
-            <w:r/>
             <w:r>
               <w:rPr>
-                <w:b w:val="0"/>
                 <w:sz w:val="18"/>
               </w:rPr>
-              <w:t>—</w:t>
+              <w:t>23/09 (corte)</w:t>
             </w:r>
           </w:p>
         </w:tc>
@@ -1250,13 +1240,11 @@
             <w:pPr>
               <w:spacing w:after="0"/>
             </w:pPr>
-            <w:r/>
             <w:r>
               <w:rPr>
-                <w:b w:val="0"/>
                 <w:sz w:val="18"/>
               </w:rPr>
-              <w:t>Pendiente</w:t>
+              <w:t>En curso: cierra con 1.6</w:t>
             </w:r>
           </w:p>
         </w:tc>
@@ -1951,13 +1939,11 @@
             <w:pPr>
               <w:spacing w:after="0"/>
             </w:pPr>
-            <w:r/>
             <w:r>
               <w:rPr>
-                <w:b w:val="0"/>
                 <w:sz w:val="18"/>
               </w:rPr>
-              <w:t>Pendiente</w:t>
+              <w:t>Pendiente (01/10)</w:t>
             </w:r>
           </w:p>
         </w:tc>
@@ -2264,32 +2250,29 @@
               <w:spacing w:after="0"/>
               <w:jc w:val="center"/>
             </w:pPr>
-            <w:r/>
             <w:r>
               <w:rPr>
-                <w:b w:val="0"/>
                 <w:sz w:val="18"/>
               </w:rPr>
-              <w:t>—</w:t>
+              <w:t>22/09</w:t>
             </w:r>
           </w:p>
         </w:tc>
         <w:tc>
           <w:tcPr>
             <w:tcW w:type="dxa" w:w="936"/>
+            <w:shd w:val="clear" w:color="auto" w:fill="E8EDE9"/>
           </w:tcPr>
           <w:p>
             <w:pPr>
               <w:spacing w:after="0"/>
               <w:jc w:val="center"/>
             </w:pPr>
-            <w:r/>
             <w:r>
               <w:rPr>
-                <w:b w:val="0"/>
                 <w:sz w:val="18"/>
               </w:rPr>
-              <w:t>—</w:t>
+              <w:t>−3 d</w:t>
             </w:r>
           </w:p>
         </w:tc>
@@ -2301,13 +2284,11 @@
             <w:pPr>
               <w:spacing w:after="0"/>
             </w:pPr>
-            <w:r/>
             <w:r>
               <w:rPr>
-                <w:b w:val="0"/>
                 <w:sz w:val="18"/>
               </w:rPr>
-              <w:t>Pendiente</w:t>
+              <w:t>Adelantada (−3 d)</w:t>
             </w:r>
           </w:p>
         </w:tc>
@@ -2380,32 +2361,29 @@
               <w:spacing w:after="0"/>
               <w:jc w:val="center"/>
             </w:pPr>
-            <w:r/>
             <w:r>
               <w:rPr>
-                <w:b w:val="0"/>
                 <w:sz w:val="18"/>
               </w:rPr>
-              <w:t>—</w:t>
+              <w:t>23/09</w:t>
             </w:r>
           </w:p>
         </w:tc>
         <w:tc>
           <w:tcPr>
             <w:tcW w:type="dxa" w:w="936"/>
+            <w:shd w:val="clear" w:color="auto" w:fill="E8EDE9"/>
           </w:tcPr>
           <w:p>
             <w:pPr>
               <w:spacing w:after="0"/>
               <w:jc w:val="center"/>
             </w:pPr>
-            <w:r/>
             <w:r>
               <w:rPr>
-                <w:b w:val="0"/>
                 <w:sz w:val="18"/>
               </w:rPr>
-              <w:t>—</w:t>
+              <w:t>−9 d</w:t>
             </w:r>
           </w:p>
         </w:tc>
@@ -2417,13 +2395,11 @@
             <w:pPr>
               <w:spacing w:after="0"/>
             </w:pPr>
-            <w:r/>
             <w:r>
               <w:rPr>
-                <w:b w:val="0"/>
                 <w:sz w:val="18"/>
               </w:rPr>
-              <w:t>Pendiente</w:t>
+              <w:t>Adelantada (−9 d)</w:t>
             </w:r>
           </w:p>
         </w:tc>
@@ -2730,32 +2706,29 @@
               <w:spacing w:after="0"/>
               <w:jc w:val="center"/>
             </w:pPr>
-            <w:r/>
             <w:r>
               <w:rPr>
-                <w:b w:val="0"/>
                 <w:sz w:val="18"/>
               </w:rPr>
-              <w:t>—</w:t>
+              <w:t>23/09</w:t>
             </w:r>
           </w:p>
         </w:tc>
         <w:tc>
           <w:tcPr>
             <w:tcW w:type="dxa" w:w="936"/>
+            <w:shd w:val="clear" w:color="auto" w:fill="E8EDE9"/>
           </w:tcPr>
           <w:p>
             <w:pPr>
               <w:spacing w:after="0"/>
               <w:jc w:val="center"/>
             </w:pPr>
-            <w:r/>
             <w:r>
               <w:rPr>
-                <w:b w:val="0"/>
                 <w:sz w:val="18"/>
               </w:rPr>
-              <w:t>—</w:t>
+              <w:t>−2 d</w:t>
             </w:r>
           </w:p>
         </w:tc>
@@ -2767,13 +2740,11 @@
             <w:pPr>
               <w:spacing w:after="0"/>
             </w:pPr>
-            <w:r/>
             <w:r>
               <w:rPr>
-                <w:b w:val="0"/>
                 <w:sz w:val="18"/>
               </w:rPr>
-              <w:t>Pendiente</w:t>
+              <w:t>Adelantada (−2 d)</w:t>
             </w:r>
           </w:p>
         </w:tc>
@@ -2846,32 +2817,29 @@
               <w:spacing w:after="0"/>
               <w:jc w:val="center"/>
             </w:pPr>
-            <w:r/>
             <w:r>
               <w:rPr>
-                <w:b w:val="0"/>
                 <w:sz w:val="18"/>
               </w:rPr>
-              <w:t>—</w:t>
+              <w:t>22/09</w:t>
             </w:r>
           </w:p>
         </w:tc>
         <w:tc>
           <w:tcPr>
             <w:tcW w:type="dxa" w:w="936"/>
+            <w:shd w:val="clear" w:color="auto" w:fill="E8EDE9"/>
           </w:tcPr>
           <w:p>
             <w:pPr>
               <w:spacing w:after="0"/>
               <w:jc w:val="center"/>
             </w:pPr>
-            <w:r/>
             <w:r>
               <w:rPr>
-                <w:b w:val="0"/>
                 <w:sz w:val="18"/>
               </w:rPr>
-              <w:t>—</w:t>
+              <w:t>−3 d</w:t>
             </w:r>
           </w:p>
         </w:tc>
@@ -2883,13 +2851,11 @@
             <w:pPr>
               <w:spacing w:after="0"/>
             </w:pPr>
-            <w:r/>
             <w:r>
               <w:rPr>
-                <w:b w:val="0"/>
                 <w:sz w:val="18"/>
               </w:rPr>
-              <w:t>Pendiente</w:t>
+              <w:t>Adelantada (−3 d)</w:t>
             </w:r>
           </w:p>
         </w:tc>
@@ -2962,13 +2928,11 @@
               <w:spacing w:after="0"/>
               <w:jc w:val="center"/>
             </w:pPr>
-            <w:r/>
             <w:r>
               <w:rPr>
-                <w:b w:val="0"/>
                 <w:sz w:val="18"/>
               </w:rPr>
-              <w:t>—</w:t>
+              <w:t>22/09</w:t>
             </w:r>
           </w:p>
         </w:tc>
@@ -2982,13 +2946,11 @@
               <w:spacing w:after="0"/>
               <w:jc w:val="center"/>
             </w:pPr>
-            <w:r/>
             <w:r>
               <w:rPr>
-                <w:b w:val="0"/>
                 <w:sz w:val="18"/>
               </w:rPr>
-              <w:t>—</w:t>
+              <w:t>+11 d</w:t>
             </w:r>
           </w:p>
         </w:tc>
@@ -3000,13 +2962,116 @@
             <w:pPr>
               <w:spacing w:after="0"/>
             </w:pPr>
-            <w:r/>
             <w:r>
               <w:rPr>
-                <w:b w:val="0"/>
                 <w:sz w:val="18"/>
               </w:rPr>
-              <w:t>Vencida sin terminar</w:t>
+              <w:t>Cerrada con alcance reducido (+11 d)</w:t>
+            </w:r>
+          </w:p>
+        </w:tc>
+      </w:tr>
+      <w:tr>
+        <w:trPr>
+          <w:cantSplit w:val="true"/>
+        </w:trPr>
+        <w:tc>
+          <w:tcPr>
+            <w:tcW w:type="dxa" w:w="648"/>
+          </w:tcPr>
+          <w:p>
+            <w:pPr>
+              <w:spacing w:after="0"/>
+              <w:jc w:val="center"/>
+            </w:pPr>
+            <w:r>
+              <w:rPr>
+                <w:sz w:val="18"/>
+              </w:rPr>
+              <w:t>—</w:t>
+            </w:r>
+          </w:p>
+        </w:tc>
+        <w:tc>
+          <w:tcPr>
+            <w:tcW w:type="dxa" w:w="3168"/>
+          </w:tcPr>
+          <w:p>
+            <w:pPr>
+              <w:spacing w:after="0"/>
+            </w:pPr>
+            <w:r>
+              <w:rPr>
+                <w:sz w:val="18"/>
+              </w:rPr>
+              <w:t>Carpeta integradora del Sprint 1 (no figuraba en la EDT)</w:t>
+            </w:r>
+          </w:p>
+        </w:tc>
+        <w:tc>
+          <w:tcPr>
+            <w:tcW w:type="dxa" w:w="1584"/>
+          </w:tcPr>
+          <w:p>
+            <w:pPr>
+              <w:spacing w:after="0"/>
+            </w:pPr>
+            <w:r>
+              <w:rPr>
+                <w:sz w:val="18"/>
+              </w:rPr>
+              <w:t>S3 (11/09)</w:t>
+            </w:r>
+          </w:p>
+        </w:tc>
+        <w:tc>
+          <w:tcPr>
+            <w:tcW w:type="dxa" w:w="864"/>
+          </w:tcPr>
+          <w:p>
+            <w:pPr>
+              <w:spacing w:after="0"/>
+              <w:jc w:val="center"/>
+            </w:pPr>
+            <w:r>
+              <w:rPr>
+                <w:sz w:val="18"/>
+              </w:rPr>
+              <w:t>23/09</w:t>
+            </w:r>
+          </w:p>
+        </w:tc>
+        <w:tc>
+          <w:tcPr>
+            <w:tcW w:type="dxa" w:w="936"/>
+            <w:shd w:val="clear" w:color="auto" w:fill="F3E3C3"/>
+          </w:tcPr>
+          <w:p>
+            <w:pPr>
+              <w:spacing w:after="0"/>
+              <w:jc w:val="center"/>
+            </w:pPr>
+            <w:r>
+              <w:rPr>
+                <w:sz w:val="18"/>
+              </w:rPr>
+              <w:t>+12 d</w:t>
+            </w:r>
+          </w:p>
+        </w:tc>
+        <w:tc>
+          <w:tcPr>
+            <w:tcW w:type="dxa" w:w="2160"/>
+          </w:tcPr>
+          <w:p>
+            <w:pPr>
+              <w:spacing w:after="0"/>
+            </w:pPr>
+            <w:r>
+              <w:rPr>
+                <w:sz w:val="18"/>
+              </w:rPr>
+              <w:t>Con atraso (+12 d)</w:t>
             </w:r>
           </w:p>
         </w:tc>
@@ -3028,7 +3093,7 @@
         <w:t xml:space="preserve">Resumen. </w:t>
       </w:r>
       <w:r>
-        <w:t>A la fecha de corte hay 14 paquetes terminados sobre 21: 12 con atraso y 2 adelantados. Los paquetes del Sprint 1 cerraron con un atraso promedio de 9.2 días corridos. La campaña de Instagram (3.5) venció el 11/09 sin entregable registrado.</w:t>
+        <w:t>Al 23/09 están terminados 19 de los 21 paquetes de la EDT: 13 con atraso y 6 adelantados. Los paquetes del Sprint 1 cerraron con un atraso promedio de 9,2 días corridos. Los ocho planificados para el Sprint 2 que ya cerraron lo hicieron con un adelanto promedio de 1,9 días. Quedan abiertos 1.6 (pruebas responsive, 01/10) y 4.6 (este control, que se cierra junto con 1.6). Fuera de la EDT, la carpeta integradora del Sprint 1 se entregó el 23/09, con 12 días de atraso.</w:t>
       </w:r>
     </w:p>
     <w:p>
@@ -3946,6 +4011,9 @@
       <w:r>
         <w:t>La cadena 1.2 → 1.3 → 1.4 → 1.6 es el camino crítico del proyecto: es la de mayor duración encadenada y termina en la entrega del sitio. En ella se produjo el mayor desvío del período (+18 días en el repositorio), que arrastró al HTML5 semántico (+11 días).</w:t>
       </w:r>
+      <w:r>
+        <w:t xml:space="preserve"> Al 23/09 la cadena está completa salvo 1.6, que ahora depende también de las imágenes de producto (riesgo R6): sin ellas, las pruebas no reflejarían el sitio real.</w:t>
+      </w:r>
     </w:p>
     <w:p>
       <w:pPr>
@@ -3955,10 +4023,10 @@
         <w:rPr>
           <w:b/>
         </w:rPr>
-        <w:t xml:space="preserve">Dependencia bloqueada. </w:t>
+        <w:t xml:space="preserve">Dependencia desbloqueada. </w:t>
       </w:r>
       <w:r>
-        <w:t>La cadena 3.5 → 3.4 está bloqueada: sin la campaña de Instagram no hay origen de tráfico para documentar el embudo de conversión.</w:t>
+        <w:t>La cadena 3.5 → 3.4 se desbloqueó el 22/09 con la contingencia del riesgo R3. La cuenta de Instagram se definió y maquetó en el documento de estrategia, con métricas proyectadas y marcadas como supuestos, sin crear la cuenta real, que la consigna no exige.</w:t>
       </w:r>
     </w:p>
     <w:p>
@@ -4295,13 +4363,11 @@
             <w:pPr>
               <w:spacing w:after="0"/>
             </w:pPr>
-            <w:r/>
             <w:r>
               <w:rPr>
-                <w:b w:val="0"/>
                 <w:sz w:val="18"/>
               </w:rPr>
-              <w:t>Vencida sin entregable</w:t>
+              <w:t>+11 días, alcance reducido</w:t>
             </w:r>
           </w:p>
         </w:tc>
@@ -4331,13 +4397,117 @@
             <w:pPr>
               <w:spacing w:after="0"/>
             </w:pPr>
-            <w:r/>
             <w:r>
               <w:rPr>
-                <w:b w:val="0"/>
                 <w:sz w:val="18"/>
               </w:rPr>
-              <w:t>Paquete incluido en la EDT pero no incorporado al tablero Kanban ni a la planificación semanal.</w:t>
+              <w:t>Paquete incluido en la EDT pero no incorporado al tablero Kanban ni a la planificación semanal. Se cerró el 22/09 con la contingencia de R3 (maqueta).</w:t>
+            </w:r>
+          </w:p>
+        </w:tc>
+      </w:tr>
+      <w:tr>
+        <w:trPr>
+          <w:cantSplit w:val="true"/>
+        </w:trPr>
+        <w:tc>
+          <w:tcPr>
+            <w:tcW w:type="dxa" w:w="2304"/>
+          </w:tcPr>
+          <w:p>
+            <w:pPr>
+              <w:spacing w:after="0"/>
+            </w:pPr>
+            <w:r>
+              <w:rPr>
+                <w:sz w:val="18"/>
+              </w:rPr>
+              <w:t>+12 días</w:t>
+            </w:r>
+          </w:p>
+        </w:tc>
+        <w:tc>
+          <w:tcPr>
+            <w:tcW w:type="dxa" w:w="1440"/>
+          </w:tcPr>
+          <w:p>
+            <w:pPr>
+              <w:spacing w:after="0"/>
+            </w:pPr>
+            <w:r>
+              <w:rPr>
+                <w:sz w:val="18"/>
+              </w:rPr>
+              <w:t>Carpeta integradora del Sprint 1</w:t>
+            </w:r>
+          </w:p>
+        </w:tc>
+        <w:tc>
+          <w:tcPr>
+            <w:tcW w:type="dxa" w:w="5616"/>
+          </w:tcPr>
+          <w:p>
+            <w:pPr>
+              <w:spacing w:after="0"/>
+            </w:pPr>
+            <w:r>
+              <w:rPr>
+                <w:sz w:val="18"/>
+              </w:rPr>
+              <w:t>Entregable de cierre que la consigna exigía pero que no figuraba en la EDT ni en el Kanban: la misma causa que el paquete 3.5.</w:t>
+            </w:r>
+          </w:p>
+        </w:tc>
+      </w:tr>
+      <w:tr>
+        <w:trPr>
+          <w:cantSplit w:val="true"/>
+        </w:trPr>
+        <w:tc>
+          <w:tcPr>
+            <w:tcW w:type="dxa" w:w="2304"/>
+          </w:tcPr>
+          <w:p>
+            <w:pPr>
+              <w:spacing w:after="0"/>
+            </w:pPr>
+            <w:r>
+              <w:rPr>
+                <w:sz w:val="18"/>
+              </w:rPr>
+              <w:t>−2 a −9 días, cerrados el 22 y 23/09</w:t>
+            </w:r>
+          </w:p>
+        </w:tc>
+        <w:tc>
+          <w:tcPr>
+            <w:tcW w:type="dxa" w:w="1440"/>
+          </w:tcPr>
+          <w:p>
+            <w:pPr>
+              <w:spacing w:after="0"/>
+            </w:pPr>
+            <w:r>
+              <w:rPr>
+                <w:sz w:val="18"/>
+              </w:rPr>
+              <w:t>2.3, 2.4, 3.3, 3.4</w:t>
+            </w:r>
+          </w:p>
+        </w:tc>
+        <w:tc>
+          <w:tcPr>
+            <w:tcW w:type="dxa" w:w="5616"/>
+          </w:tcPr>
+          <w:p>
+            <w:pPr>
+              <w:spacing w:after="0"/>
+            </w:pPr>
+            <w:r>
+              <w:rPr>
+                <w:sz w:val="18"/>
+              </w:rPr>
+              <w:t>Segunda ola de fast tracking sobre las ramas Legal y Negocio, que el control anterior había señalado como el nuevo foco de riesgo.</w:t>
             </w:r>
           </w:p>
         </w:tc>
@@ -4429,6 +4599,9 @@
       <w:r>
         <w:t>El 22/09 se completaron en el mismo día el HTML5 semántico, la hoja de estilos responsive y productos.json. La rama de Software pasó de +18 días de atraso a −3 días respecto del plan del Sprint 2: el camino crítico quedó recuperado.</w:t>
       </w:r>
+      <w:r>
+        <w:t xml:space="preserve"> Una segunda ola, el 22 y el 23/09, cerró la política de privacidad, el embudo, el licenciamiento y el informe comparativo antes de su fecha planificada.</w:t>
+      </w:r>
     </w:p>
     <w:p>
       <w:pPr>
@@ -4518,11 +4691,12 @@
         </w:trPr>
         <w:tc>
           <w:tcPr>
-            <w:tcW w:type="dxa" w:w="720"/>
+            <w:tcW w:type="dxa" w:w="737"/>
             <w:shd w:val="clear" w:color="auto" w:fill="2F4B3C"/>
           </w:tcPr>
           <w:p>
             <w:pPr>
+              <w:keepNext/>
               <w:spacing w:after="0"/>
               <w:jc w:val="center"/>
             </w:pPr>
@@ -4539,11 +4713,12 @@
         </w:tc>
         <w:tc>
           <w:tcPr>
-            <w:tcW w:type="dxa" w:w="5472"/>
+            <w:tcW w:type="dxa" w:w="4365"/>
             <w:shd w:val="clear" w:color="auto" w:fill="2F4B3C"/>
           </w:tcPr>
           <w:p>
             <w:pPr>
+              <w:keepNext/>
               <w:spacing w:after="0"/>
             </w:pPr>
             <w:r/>
@@ -4559,32 +4734,31 @@
         </w:tc>
         <w:tc>
           <w:tcPr>
-            <w:tcW w:type="dxa" w:w="1440"/>
+            <w:tcW w:type="dxa" w:w="2268"/>
             <w:shd w:val="clear" w:color="auto" w:fill="2F4B3C"/>
           </w:tcPr>
           <w:p>
             <w:pPr>
+              <w:keepNext/>
               <w:spacing w:after="0"/>
               <w:jc w:val="center"/>
             </w:pPr>
-            <w:r/>
             <w:r>
               <w:rPr>
-                <w:b/>
-                <w:color w:val="FFFFFF"/>
                 <w:sz w:val="18"/>
               </w:rPr>
-              <w:t>Nueva fecha</w:t>
+              <w:t>Fecha comprometida y estado</w:t>
             </w:r>
           </w:p>
         </w:tc>
         <w:tc>
           <w:tcPr>
-            <w:tcW w:type="dxa" w:w="1728"/>
+            <w:tcW w:type="dxa" w:w="1701"/>
             <w:shd w:val="clear" w:color="auto" w:fill="2F4B3C"/>
           </w:tcPr>
           <w:p>
             <w:pPr>
+              <w:keepNext/>
               <w:spacing w:after="0"/>
             </w:pPr>
             <w:r/>
@@ -4605,10 +4779,11 @@
         </w:trPr>
         <w:tc>
           <w:tcPr>
-            <w:tcW w:type="dxa" w:w="720"/>
+            <w:tcW w:type="dxa" w:w="737"/>
           </w:tcPr>
           <w:p>
             <w:pPr>
+              <w:keepNext/>
               <w:spacing w:after="0"/>
               <w:jc w:val="center"/>
             </w:pPr>
@@ -4624,10 +4799,11 @@
         </w:tc>
         <w:tc>
           <w:tcPr>
-            <w:tcW w:type="dxa" w:w="5472"/>
+            <w:tcW w:type="dxa" w:w="4365"/>
           </w:tcPr>
           <w:p>
             <w:pPr>
+              <w:keepNext/>
               <w:spacing w:after="0"/>
             </w:pPr>
             <w:r/>
@@ -4642,29 +4818,29 @@
         </w:tc>
         <w:tc>
           <w:tcPr>
-            <w:tcW w:type="dxa" w:w="1440"/>
+            <w:tcW w:type="dxa" w:w="2268"/>
           </w:tcPr>
           <w:p>
             <w:pPr>
+              <w:keepNext/>
               <w:spacing w:after="0"/>
               <w:jc w:val="center"/>
             </w:pPr>
-            <w:r/>
             <w:r>
               <w:rPr>
-                <w:b w:val="0"/>
                 <w:sz w:val="18"/>
               </w:rPr>
-              <w:t>24/09</w:t>
+              <w:t>24/09 · hecho el 22/09 (maqueta)</w:t>
             </w:r>
           </w:p>
         </w:tc>
         <w:tc>
           <w:tcPr>
-            <w:tcW w:type="dxa" w:w="1728"/>
+            <w:tcW w:type="dxa" w:w="1701"/>
           </w:tcPr>
           <w:p>
             <w:pPr>
+              <w:keepNext/>
               <w:spacing w:after="0"/>
             </w:pPr>
             <w:r/>
@@ -4684,10 +4860,11 @@
         </w:trPr>
         <w:tc>
           <w:tcPr>
-            <w:tcW w:type="dxa" w:w="720"/>
+            <w:tcW w:type="dxa" w:w="737"/>
           </w:tcPr>
           <w:p>
             <w:pPr>
+              <w:keepNext/>
               <w:spacing w:after="0"/>
               <w:jc w:val="center"/>
             </w:pPr>
@@ -4703,10 +4880,11 @@
         </w:tc>
         <w:tc>
           <w:tcPr>
-            <w:tcW w:type="dxa" w:w="5472"/>
+            <w:tcW w:type="dxa" w:w="4365"/>
           </w:tcPr>
           <w:p>
             <w:pPr>
+              <w:keepNext/>
               <w:spacing w:after="0"/>
             </w:pPr>
             <w:r/>
@@ -4721,29 +4899,29 @@
         </w:tc>
         <w:tc>
           <w:tcPr>
-            <w:tcW w:type="dxa" w:w="1440"/>
+            <w:tcW w:type="dxa" w:w="2268"/>
           </w:tcPr>
           <w:p>
             <w:pPr>
+              <w:keepNext/>
               <w:spacing w:after="0"/>
               <w:jc w:val="center"/>
             </w:pPr>
-            <w:r/>
             <w:r>
               <w:rPr>
-                <w:b w:val="0"/>
                 <w:sz w:val="18"/>
               </w:rPr>
-              <w:t>25/09</w:t>
+              <w:t>25/09 · hecho el 22/09</w:t>
             </w:r>
           </w:p>
         </w:tc>
         <w:tc>
           <w:tcPr>
-            <w:tcW w:type="dxa" w:w="1728"/>
+            <w:tcW w:type="dxa" w:w="1701"/>
           </w:tcPr>
           <w:p>
             <w:pPr>
+              <w:keepNext/>
               <w:spacing w:after="0"/>
             </w:pPr>
             <w:r/>
@@ -4763,10 +4941,11 @@
         </w:trPr>
         <w:tc>
           <w:tcPr>
-            <w:tcW w:type="dxa" w:w="720"/>
+            <w:tcW w:type="dxa" w:w="737"/>
           </w:tcPr>
           <w:p>
             <w:pPr>
+              <w:keepNext/>
               <w:spacing w:after="0"/>
               <w:jc w:val="center"/>
             </w:pPr>
@@ -4782,10 +4961,11 @@
         </w:tc>
         <w:tc>
           <w:tcPr>
-            <w:tcW w:type="dxa" w:w="5472"/>
+            <w:tcW w:type="dxa" w:w="4365"/>
           </w:tcPr>
           <w:p>
             <w:pPr>
+              <w:keepNext/>
               <w:spacing w:after="0"/>
             </w:pPr>
             <w:r/>
@@ -4800,29 +4980,29 @@
         </w:tc>
         <w:tc>
           <w:tcPr>
-            <w:tcW w:type="dxa" w:w="1440"/>
+            <w:tcW w:type="dxa" w:w="2268"/>
           </w:tcPr>
           <w:p>
             <w:pPr>
+              <w:keepNext/>
               <w:spacing w:after="0"/>
               <w:jc w:val="center"/>
             </w:pPr>
-            <w:r/>
             <w:r>
               <w:rPr>
-                <w:b w:val="0"/>
                 <w:sz w:val="18"/>
               </w:rPr>
-              <w:t>25/09</w:t>
+              <w:t>25/09 · hecho el 22/09</w:t>
             </w:r>
           </w:p>
         </w:tc>
         <w:tc>
           <w:tcPr>
-            <w:tcW w:type="dxa" w:w="1728"/>
+            <w:tcW w:type="dxa" w:w="1701"/>
           </w:tcPr>
           <w:p>
             <w:pPr>
+              <w:keepNext/>
               <w:spacing w:after="0"/>
             </w:pPr>
             <w:r/>
@@ -4842,10 +5022,11 @@
         </w:trPr>
         <w:tc>
           <w:tcPr>
-            <w:tcW w:type="dxa" w:w="720"/>
+            <w:tcW w:type="dxa" w:w="737"/>
           </w:tcPr>
           <w:p>
             <w:pPr>
+              <w:keepNext/>
               <w:spacing w:after="0"/>
               <w:jc w:val="center"/>
             </w:pPr>
@@ -4861,10 +5042,11 @@
         </w:tc>
         <w:tc>
           <w:tcPr>
-            <w:tcW w:type="dxa" w:w="5472"/>
+            <w:tcW w:type="dxa" w:w="4365"/>
           </w:tcPr>
           <w:p>
             <w:pPr>
+              <w:keepNext/>
               <w:spacing w:after="0"/>
             </w:pPr>
             <w:r/>
@@ -4879,29 +5061,29 @@
         </w:tc>
         <w:tc>
           <w:tcPr>
-            <w:tcW w:type="dxa" w:w="1440"/>
+            <w:tcW w:type="dxa" w:w="2268"/>
           </w:tcPr>
           <w:p>
             <w:pPr>
+              <w:keepNext/>
               <w:spacing w:after="0"/>
               <w:jc w:val="center"/>
             </w:pPr>
-            <w:r/>
             <w:r>
               <w:rPr>
-                <w:b w:val="0"/>
                 <w:sz w:val="18"/>
               </w:rPr>
-              <w:t>29/09</w:t>
+              <w:t>29/09 · hecho el 23/09</w:t>
             </w:r>
           </w:p>
         </w:tc>
         <w:tc>
           <w:tcPr>
-            <w:tcW w:type="dxa" w:w="1728"/>
+            <w:tcW w:type="dxa" w:w="1701"/>
           </w:tcPr>
           <w:p>
             <w:pPr>
+              <w:keepNext/>
               <w:spacing w:after="0"/>
             </w:pPr>
             <w:r/>
@@ -4921,10 +5103,11 @@
         </w:trPr>
         <w:tc>
           <w:tcPr>
-            <w:tcW w:type="dxa" w:w="720"/>
+            <w:tcW w:type="dxa" w:w="737"/>
           </w:tcPr>
           <w:p>
             <w:pPr>
+              <w:keepNext/>
               <w:spacing w:after="0"/>
               <w:jc w:val="center"/>
             </w:pPr>
@@ -4940,10 +5123,11 @@
         </w:tc>
         <w:tc>
           <w:tcPr>
-            <w:tcW w:type="dxa" w:w="5472"/>
+            <w:tcW w:type="dxa" w:w="4365"/>
           </w:tcPr>
           <w:p>
             <w:pPr>
+              <w:keepNext/>
               <w:spacing w:after="0"/>
             </w:pPr>
             <w:r/>
@@ -4958,29 +5142,29 @@
         </w:tc>
         <w:tc>
           <w:tcPr>
-            <w:tcW w:type="dxa" w:w="1440"/>
+            <w:tcW w:type="dxa" w:w="2268"/>
           </w:tcPr>
           <w:p>
             <w:pPr>
+              <w:keepNext/>
               <w:spacing w:after="0"/>
               <w:jc w:val="center"/>
             </w:pPr>
-            <w:r/>
             <w:r>
               <w:rPr>
-                <w:b w:val="0"/>
                 <w:sz w:val="18"/>
               </w:rPr>
-              <w:t>30/09</w:t>
+              <w:t>30/09 · hecho el 23/09</w:t>
             </w:r>
           </w:p>
         </w:tc>
         <w:tc>
           <w:tcPr>
-            <w:tcW w:type="dxa" w:w="1728"/>
+            <w:tcW w:type="dxa" w:w="1701"/>
           </w:tcPr>
           <w:p>
             <w:pPr>
+              <w:keepNext/>
               <w:spacing w:after="0"/>
             </w:pPr>
             <w:r/>
@@ -5000,10 +5184,11 @@
         </w:trPr>
         <w:tc>
           <w:tcPr>
-            <w:tcW w:type="dxa" w:w="720"/>
+            <w:tcW w:type="dxa" w:w="737"/>
           </w:tcPr>
           <w:p>
             <w:pPr>
+              <w:keepNext/>
               <w:spacing w:after="0"/>
               <w:jc w:val="center"/>
             </w:pPr>
@@ -5019,10 +5204,11 @@
         </w:tc>
         <w:tc>
           <w:tcPr>
-            <w:tcW w:type="dxa" w:w="5472"/>
+            <w:tcW w:type="dxa" w:w="4365"/>
           </w:tcPr>
           <w:p>
             <w:pPr>
+              <w:keepNext/>
               <w:spacing w:after="0"/>
             </w:pPr>
             <w:r/>
@@ -5037,29 +5223,29 @@
         </w:tc>
         <w:tc>
           <w:tcPr>
-            <w:tcW w:type="dxa" w:w="1440"/>
+            <w:tcW w:type="dxa" w:w="2268"/>
           </w:tcPr>
           <w:p>
             <w:pPr>
+              <w:keepNext/>
               <w:spacing w:after="0"/>
               <w:jc w:val="center"/>
             </w:pPr>
-            <w:r/>
             <w:r>
               <w:rPr>
-                <w:b w:val="0"/>
                 <w:sz w:val="18"/>
               </w:rPr>
-              <w:t>30/09</w:t>
+              <w:t>30/09 · hecho el 22/09</w:t>
             </w:r>
           </w:p>
         </w:tc>
         <w:tc>
           <w:tcPr>
-            <w:tcW w:type="dxa" w:w="1728"/>
+            <w:tcW w:type="dxa" w:w="1701"/>
           </w:tcPr>
           <w:p>
             <w:pPr>
+              <w:keepNext/>
               <w:spacing w:after="0"/>
             </w:pPr>
             <w:r/>
@@ -5079,10 +5265,86 @@
         </w:trPr>
         <w:tc>
           <w:tcPr>
-            <w:tcW w:type="dxa" w:w="720"/>
+            <w:tcW w:type="dxa" w:w="737"/>
           </w:tcPr>
           <w:p>
             <w:pPr>
+              <w:keepNext/>
+              <w:spacing w:after="0"/>
+              <w:jc w:val="center"/>
+            </w:pPr>
+            <w:r>
+              <w:rPr>
+                <w:sz w:val="18"/>
+              </w:rPr>
+              <w:t>—</w:t>
+            </w:r>
+          </w:p>
+        </w:tc>
+        <w:tc>
+          <w:tcPr>
+            <w:tcW w:type="dxa" w:w="4365"/>
+          </w:tcPr>
+          <w:p>
+            <w:pPr>
+              <w:keepNext/>
+              <w:spacing w:after="0"/>
+            </w:pPr>
+            <w:r>
+              <w:rPr>
+                <w:sz w:val="18"/>
+              </w:rPr>
+              <w:t>Imágenes de producto generadas con IA (riesgo R6)</w:t>
+            </w:r>
+          </w:p>
+        </w:tc>
+        <w:tc>
+          <w:tcPr>
+            <w:tcW w:type="dxa" w:w="2268"/>
+          </w:tcPr>
+          <w:p>
+            <w:pPr>
+              <w:keepNext/>
+              <w:spacing w:after="0"/>
+              <w:jc w:val="center"/>
+            </w:pPr>
+            <w:r>
+              <w:rPr>
+                <w:sz w:val="18"/>
+              </w:rPr>
+              <w:t>29/09 · pendiente</w:t>
+            </w:r>
+          </w:p>
+        </w:tc>
+        <w:tc>
+          <w:tcPr>
+            <w:tcW w:type="dxa" w:w="1701"/>
+          </w:tcPr>
+          <w:p>
+            <w:pPr>
+              <w:keepNext/>
+              <w:spacing w:after="0"/>
+            </w:pPr>
+            <w:r>
+              <w:rPr>
+                <w:sz w:val="18"/>
+              </w:rPr>
+              <w:t>—</w:t>
+            </w:r>
+          </w:p>
+        </w:tc>
+      </w:tr>
+      <w:tr>
+        <w:trPr>
+          <w:cantSplit w:val="true"/>
+        </w:trPr>
+        <w:tc>
+          <w:tcPr>
+            <w:tcW w:type="dxa" w:w="737"/>
+          </w:tcPr>
+          <w:p>
+            <w:pPr>
+              <w:keepNext/>
               <w:spacing w:after="0"/>
               <w:jc w:val="center"/>
             </w:pPr>
@@ -5098,10 +5360,11 @@
         </w:tc>
         <w:tc>
           <w:tcPr>
-            <w:tcW w:type="dxa" w:w="5472"/>
+            <w:tcW w:type="dxa" w:w="4365"/>
           </w:tcPr>
           <w:p>
             <w:pPr>
+              <w:keepNext/>
               <w:spacing w:after="0"/>
             </w:pPr>
             <w:r/>
@@ -5116,38 +5379,36 @@
         </w:tc>
         <w:tc>
           <w:tcPr>
-            <w:tcW w:type="dxa" w:w="1440"/>
+            <w:tcW w:type="dxa" w:w="2268"/>
           </w:tcPr>
           <w:p>
             <w:pPr>
+              <w:keepNext/>
               <w:spacing w:after="0"/>
               <w:jc w:val="center"/>
             </w:pPr>
-            <w:r/>
             <w:r>
               <w:rPr>
-                <w:b w:val="0"/>
                 <w:sz w:val="18"/>
               </w:rPr>
-              <w:t>01/10</w:t>
+              <w:t>01/10 · pendiente</w:t>
             </w:r>
           </w:p>
         </w:tc>
         <w:tc>
           <w:tcPr>
-            <w:tcW w:type="dxa" w:w="1728"/>
+            <w:tcW w:type="dxa" w:w="1701"/>
           </w:tcPr>
           <w:p>
             <w:pPr>
+              <w:keepNext/>
               <w:spacing w:after="0"/>
             </w:pPr>
-            <w:r/>
             <w:r>
               <w:rPr>
-                <w:b w:val="0"/>
                 <w:sz w:val="18"/>
               </w:rPr>
-              <w:t>1.4</w:t>
+              <w:t>1.4 e imágenes (R6)</w:t>
             </w:r>
           </w:p>
         </w:tc>
@@ -5158,10 +5419,11 @@
         </w:trPr>
         <w:tc>
           <w:tcPr>
-            <w:tcW w:type="dxa" w:w="720"/>
+            <w:tcW w:type="dxa" w:w="737"/>
           </w:tcPr>
           <w:p>
             <w:pPr>
+              <w:keepNext/>
               <w:spacing w:after="0"/>
               <w:jc w:val="center"/>
             </w:pPr>
@@ -5177,10 +5439,11 @@
         </w:tc>
         <w:tc>
           <w:tcPr>
-            <w:tcW w:type="dxa" w:w="5472"/>
+            <w:tcW w:type="dxa" w:w="4365"/>
           </w:tcPr>
           <w:p>
             <w:pPr>
+              <w:keepNext/>
               <w:spacing w:after="0"/>
             </w:pPr>
             <w:r/>
@@ -5195,29 +5458,29 @@
         </w:tc>
         <w:tc>
           <w:tcPr>
-            <w:tcW w:type="dxa" w:w="1440"/>
+            <w:tcW w:type="dxa" w:w="2268"/>
           </w:tcPr>
           <w:p>
             <w:pPr>
+              <w:keepNext/>
               <w:spacing w:after="0"/>
               <w:jc w:val="center"/>
             </w:pPr>
-            <w:r/>
             <w:r>
               <w:rPr>
-                <w:b w:val="0"/>
                 <w:sz w:val="18"/>
               </w:rPr>
-              <w:t>01/10</w:t>
+              <w:t>01/10 · en curso (este control)</w:t>
             </w:r>
           </w:p>
         </w:tc>
         <w:tc>
           <w:tcPr>
-            <w:tcW w:type="dxa" w:w="1728"/>
+            <w:tcW w:type="dxa" w:w="1701"/>
           </w:tcPr>
           <w:p>
             <w:pPr>
+              <w:keepNext/>
               <w:spacing w:after="0"/>
             </w:pPr>
             <w:r/>
@@ -5237,7 +5500,7 @@
         </w:trPr>
         <w:tc>
           <w:tcPr>
-            <w:tcW w:type="dxa" w:w="720"/>
+            <w:tcW w:type="dxa" w:w="737"/>
           </w:tcPr>
           <w:p>
             <w:pPr>
@@ -5256,7 +5519,7 @@
         </w:tc>
         <w:tc>
           <w:tcPr>
-            <w:tcW w:type="dxa" w:w="5472"/>
+            <w:tcW w:type="dxa" w:w="4365"/>
           </w:tcPr>
           <w:p>
             <w:pPr>
@@ -5274,26 +5537,24 @@
         </w:tc>
         <w:tc>
           <w:tcPr>
-            <w:tcW w:type="dxa" w:w="1440"/>
+            <w:tcW w:type="dxa" w:w="2268"/>
           </w:tcPr>
           <w:p>
             <w:pPr>
               <w:spacing w:after="0"/>
               <w:jc w:val="center"/>
             </w:pPr>
-            <w:r/>
             <w:r>
               <w:rPr>
-                <w:b w:val="0"/>
                 <w:sz w:val="18"/>
               </w:rPr>
-              <w:t>02/10</w:t>
+              <w:t>02/10 · pendiente</w:t>
             </w:r>
           </w:p>
         </w:tc>
         <w:tc>
           <w:tcPr>
-            <w:tcW w:type="dxa" w:w="1728"/>
+            <w:tcW w:type="dxa" w:w="1701"/>
           </w:tcPr>
           <w:p>
             <w:pPr>
@@ -5329,7 +5590,57 @@
         <w:jc w:val="both"/>
       </w:pPr>
       <w:r>
-        <w:t>El Sprint 1 cerró con atrasos generalizados originados en la acumulación de trabajo hacia las fechas de corrección y en un repositorio que quedó sin inicializar dentro del camino crítico. El adelanto de las tareas técnicas del Sprint 2 recuperó ese camino, por lo que el riesgo de la entrega del 02/10 se concentra ahora en los entregables escritos (Legal y Negocio) y en la campaña de Instagram pendiente. El cronograma se volverá a controlar en la semana 6 contra esta misma línea base.</w:t>
+        <w:t>El Sprint 1 cerró con atrasos generalizados, originados en la acumulación de trabajo hacia las fechas de corrección y en un repositorio que quedó sin inicializar dentro del camino crítico. El Sprint 2 revirtió esa tendencia: el fast tracking recuperó primero el camino crítico y después las ramas Legal y Negocio, y los ocho paquetes del Sprint 2 ya cerrados lo hicieron en promedio 1,9 días antes de lo planificado. Al corte del 23/09, el riesgo de la entrega del 02/10 se concentra en un solo punto: las imágenes de producto, que condicionan las pruebas responsive.</w:t>
+      </w:r>
+    </w:p>
+    <w:p>
+      <w:pPr>
+        <w:pStyle w:val="Heading1"/>
+      </w:pPr>
+      <w:r>
+        <w:t>9. Lecciones aprendidas</w:t>
+      </w:r>
+    </w:p>
+    <w:p>
+      <w:pPr>
+        <w:pStyle w:val="ListBullet"/>
+      </w:pPr>
+      <w:r>
+        <w:rPr>
+          <w:b/>
+        </w:rPr>
+        <w:t xml:space="preserve">Lo que no está en el tablero no se hace. </w:t>
+      </w:r>
+      <w:r>
+        <w:t>Los dos desvíos sin causa técnica (la campaña de Instagram y la carpeta integradora) comparten origen: eran entregables exigidos que no se cargaron en la EDT ni en el Kanban. Para el Sprint 3, cada consigna se traslada completa al tablero el primer día.</w:t>
+      </w:r>
+    </w:p>
+    <w:p>
+      <w:pPr>
+        <w:pStyle w:val="ListBullet"/>
+      </w:pPr>
+      <w:r>
+        <w:rPr>
+          <w:b/>
+        </w:rPr>
+        <w:t xml:space="preserve">Un commit cierra una tarea; crearla no. </w:t>
+      </w:r>
+      <w:r>
+        <w:t>El repositorio contó como iniciado durante 18 días sin un solo commit. Desde el 22/09, una tarea pasa a «Hecho» solo con evidencia verificable: commit o documento.</w:t>
+      </w:r>
+    </w:p>
+    <w:p>
+      <w:pPr>
+        <w:pStyle w:val="ListBullet"/>
+      </w:pPr>
+      <w:r>
+        <w:rPr>
+          <w:b/>
+        </w:rPr>
+        <w:t xml:space="preserve">En un equipo unipersonal, la secuencia importa más que el esfuerzo. </w:t>
+      </w:r>
+      <w:r>
+        <w:t>El atraso del Sprint 1 no se recuperó trabajando más horas, sino ordenando las tareas por dependencia y cerrando el camino crítico primero.</w:t>
       </w:r>
     </w:p>
     <w:sectPr>

</xml_diff>

<commit_message>
Control de desvíos final y cierre de riesgos del Sprint 2 (corte 28/09)
- Gantt regenerado con corte al 28/09: 21 de 21 paquetes terminados,
  los diez del Sprint 2 con 2,3 días de adelanto promedio.
- Matriz de riesgos: R6 cerrado con la contingencia, R7 en monitoreo
  hasta la prueba en un teléfono real y R4 con la respuesta aplicada.
- Solicitud de cambio de alcance SC-01 (riesgo R4), para aprobación
  del docente.
- Contingencia de R6 en el sitio: las tarjetas usan láminas de color
  en lugar de imágenes inexistentes.

Co-Authored-By: Claude Opus 5.5 <noreply@anthropic.com>
</commit_message>
<xml_diff>
--- a/docs/sprint-2/01_Diagrama_de_Gantt_y_Control_de_Desvios.docx
+++ b/docs/sprint-2/01_Diagrama_de_Gantt_y_Control_de_Desvios.docx
@@ -103,7 +103,7 @@
               <w:spacing w:after="0"/>
             </w:pPr>
             <w:r>
-              <w:t>Sprint 2 — Semana 5 — Diagrama de Gantt y Control de Desvíos (control de cierre)</w:t>
+              <w:t>Sprint 2 — Semana 6 — Diagrama de Gantt y Control de Desvíos (control final)</w:t>
             </w:r>
           </w:p>
         </w:tc>
@@ -247,7 +247,7 @@
               <w:spacing w:after="0"/>
             </w:pPr>
             <w:r>
-              <w:t>23 de septiembre de 2026</w:t>
+              <w:t>28 de septiembre de 2026</w:t>
             </w:r>
           </w:p>
         </w:tc>
@@ -324,10 +324,11 @@
         <w:rPr>
           <w:b/>
         </w:rPr>
-        <w:t xml:space="preserve">Fecha de corte. </w:t>
+        <w:t>Fecha de corte.</w:t>
       </w:r>
       <w:r>
-        <w:t>23 de septiembre de 2026 (miércoles de la semana 5). Esta versión es el control de cierre del Sprint 2, adelantado respecto de la semana 6 prevista. La versión anterior, con corte el 22/09, se conserva en el historial del repositorio.</w:t>
+        <w:rPr/>
+        <w:t xml:space="preserve"> 28 de septiembre de 2026 (lunes de la semana 6). Esta versión es el control final del Sprint 2. Las versiones anteriores, con corte el 22/09 y el 23/09, se conservan en el historial del repositorio.</w:t>
       </w:r>
     </w:p>
     <w:p>
@@ -368,7 +369,7 @@
       <w:r>
         <w:drawing>
           <wp:inline xmlns:a="http://schemas.openxmlformats.org/drawingml/2006/main" xmlns:pic="http://schemas.openxmlformats.org/drawingml/2006/picture">
-            <wp:extent cx="5943600" cy="3459424"/>
+            <wp:extent cx="5943600" cy="3690806"/>
             <wp:docPr id="1" name="Picture 1"/>
             <wp:cNvGraphicFramePr>
               <a:graphicFrameLocks noChangeAspect="1"/>
@@ -389,7 +390,7 @@
                   <pic:spPr>
                     <a:xfrm>
                       <a:off x="0" y="0"/>
-                      <a:ext cx="5943600" cy="3459424"/>
+                      <a:ext cx="5943600" cy="3690806"/>
                     </a:xfrm>
                     <a:prstGeom prst="rect"/>
                   </pic:spPr>
@@ -1209,26 +1210,25 @@
               <w:rPr>
                 <w:sz w:val="18"/>
               </w:rPr>
-              <w:t>23/09 (corte)</w:t>
+              <w:t>28/09</w:t>
             </w:r>
           </w:p>
         </w:tc>
         <w:tc>
           <w:tcPr>
             <w:tcW w:type="dxa" w:w="936"/>
+            <w:shd w:val="clear" w:color="auto" w:fill="E8EDE9"/>
           </w:tcPr>
           <w:p>
             <w:pPr>
               <w:spacing w:after="0"/>
               <w:jc w:val="center"/>
             </w:pPr>
-            <w:r/>
             <w:r>
               <w:rPr>
-                <w:b w:val="0"/>
                 <w:sz w:val="18"/>
               </w:rPr>
-              <w:t>—</w:t>
+              <w:t>−4 d</w:t>
             </w:r>
           </w:p>
         </w:tc>
@@ -1244,7 +1244,7 @@
               <w:rPr>
                 <w:sz w:val="18"/>
               </w:rPr>
-              <w:t>En curso: cierra con 1.6</w:t>
+              <w:t>Adelantada (−4 d)</w:t>
             </w:r>
           </w:p>
         </w:tc>
@@ -1902,32 +1902,29 @@
               <w:spacing w:after="0"/>
               <w:jc w:val="center"/>
             </w:pPr>
-            <w:r/>
             <w:r>
               <w:rPr>
-                <w:b w:val="0"/>
                 <w:sz w:val="18"/>
               </w:rPr>
-              <w:t>—</w:t>
+              <w:t>28/09</w:t>
             </w:r>
           </w:p>
         </w:tc>
         <w:tc>
           <w:tcPr>
             <w:tcW w:type="dxa" w:w="936"/>
+            <w:shd w:val="clear" w:color="auto" w:fill="E8EDE9"/>
           </w:tcPr>
           <w:p>
             <w:pPr>
               <w:spacing w:after="0"/>
               <w:jc w:val="center"/>
             </w:pPr>
-            <w:r/>
             <w:r>
               <w:rPr>
-                <w:b w:val="0"/>
                 <w:sz w:val="18"/>
               </w:rPr>
-              <w:t>—</w:t>
+              <w:t>−4 d</w:t>
             </w:r>
           </w:p>
         </w:tc>
@@ -1943,7 +1940,7 @@
               <w:rPr>
                 <w:sz w:val="18"/>
               </w:rPr>
-              <w:t>Pendiente (01/10)</w:t>
+              <w:t>Adelantada (−4 d)</w:t>
             </w:r>
           </w:p>
         </w:tc>
@@ -3076,6 +3073,215 @@
           </w:p>
         </w:tc>
       </w:tr>
+      <w:tr>
+        <w:trPr>
+          <w:cantSplit w:val="true"/>
+        </w:trPr>
+        <w:tc>
+          <w:tcPr>
+            <w:tcW w:type="dxa" w:w="648"/>
+          </w:tcPr>
+          <w:p>
+            <w:pPr>
+              <w:spacing w:after="0"/>
+              <w:jc w:val="center"/>
+            </w:pPr>
+            <w:r>
+              <w:rPr>
+                <w:sz w:val="18"/>
+              </w:rPr>
+              <w:t>—</w:t>
+            </w:r>
+          </w:p>
+        </w:tc>
+        <w:tc>
+          <w:tcPr>
+            <w:tcW w:type="dxa" w:w="3168"/>
+          </w:tcPr>
+          <w:p>
+            <w:pPr>
+              <w:spacing w:after="0"/>
+            </w:pPr>
+            <w:r>
+              <w:rPr>
+                <w:sz w:val="18"/>
+              </w:rPr>
+              <w:t>Imágenes de producto con IA (riesgo R6; no figuraba en la EDT)</w:t>
+            </w:r>
+          </w:p>
+        </w:tc>
+        <w:tc>
+          <w:tcPr>
+            <w:tcW w:type="dxa" w:w="1584"/>
+          </w:tcPr>
+          <w:p>
+            <w:pPr>
+              <w:spacing w:after="0"/>
+            </w:pPr>
+            <w:r>
+              <w:rPr>
+                <w:sz w:val="18"/>
+              </w:rPr>
+              <w:t>29/09</w:t>
+            </w:r>
+          </w:p>
+        </w:tc>
+        <w:tc>
+          <w:tcPr>
+            <w:tcW w:type="dxa" w:w="864"/>
+          </w:tcPr>
+          <w:p>
+            <w:pPr>
+              <w:spacing w:after="0"/>
+              <w:jc w:val="center"/>
+            </w:pPr>
+            <w:r>
+              <w:rPr>
+                <w:sz w:val="18"/>
+              </w:rPr>
+              <w:t>28/09</w:t>
+            </w:r>
+          </w:p>
+        </w:tc>
+        <w:tc>
+          <w:tcPr>
+            <w:tcW w:type="dxa" w:w="936"/>
+          </w:tcPr>
+          <w:p>
+            <w:pPr>
+              <w:spacing w:after="0"/>
+              <w:jc w:val="center"/>
+            </w:pPr>
+            <w:r>
+              <w:rPr>
+                <w:sz w:val="18"/>
+              </w:rPr>
+              <w:t>—</w:t>
+            </w:r>
+          </w:p>
+        </w:tc>
+        <w:tc>
+          <w:tcPr>
+            <w:tcW w:type="dxa" w:w="2160"/>
+          </w:tcPr>
+          <w:p>
+            <w:pPr>
+              <w:spacing w:after="0"/>
+            </w:pPr>
+            <w:r>
+              <w:rPr>
+                <w:sz w:val="18"/>
+              </w:rPr>
+              <w:t>Contingencia aplicada: pasa al Sprint 3</w:t>
+            </w:r>
+          </w:p>
+        </w:tc>
+      </w:tr>
+      <w:tr>
+        <w:trPr>
+          <w:cantSplit w:val="true"/>
+        </w:trPr>
+        <w:tc>
+          <w:tcPr>
+            <w:tcW w:type="dxa" w:w="648"/>
+          </w:tcPr>
+          <w:p>
+            <w:pPr>
+              <w:spacing w:after="0"/>
+              <w:jc w:val="center"/>
+            </w:pPr>
+            <w:r>
+              <w:rPr>
+                <w:sz w:val="18"/>
+              </w:rPr>
+              <w:t>—</w:t>
+            </w:r>
+          </w:p>
+        </w:tc>
+        <w:tc>
+          <w:tcPr>
+            <w:tcW w:type="dxa" w:w="3168"/>
+          </w:tcPr>
+          <w:p>
+            <w:pPr>
+              <w:spacing w:after="0"/>
+            </w:pPr>
+            <w:r>
+              <w:rPr>
+                <w:sz w:val="18"/>
+              </w:rPr>
+              <w:t>Solicitud de cambio de alcance (riesgo R4; no figuraba en la EDT)</w:t>
+            </w:r>
+          </w:p>
+        </w:tc>
+        <w:tc>
+          <w:tcPr>
+            <w:tcW w:type="dxa" w:w="1584"/>
+          </w:tcPr>
+          <w:p>
+            <w:pPr>
+              <w:spacing w:after="0"/>
+            </w:pPr>
+            <w:r>
+              <w:rPr>
+                <w:sz w:val="18"/>
+              </w:rPr>
+              <w:t>02/10</w:t>
+            </w:r>
+          </w:p>
+        </w:tc>
+        <w:tc>
+          <w:tcPr>
+            <w:tcW w:type="dxa" w:w="864"/>
+          </w:tcPr>
+          <w:p>
+            <w:pPr>
+              <w:spacing w:after="0"/>
+              <w:jc w:val="center"/>
+            </w:pPr>
+            <w:r>
+              <w:rPr>
+                <w:sz w:val="18"/>
+              </w:rPr>
+              <w:t>28/09</w:t>
+            </w:r>
+          </w:p>
+        </w:tc>
+        <w:tc>
+          <w:tcPr>
+            <w:tcW w:type="dxa" w:w="936"/>
+            <w:shd w:val="clear" w:color="auto" w:fill="E8EDE9"/>
+          </w:tcPr>
+          <w:p>
+            <w:pPr>
+              <w:spacing w:after="0"/>
+              <w:jc w:val="center"/>
+            </w:pPr>
+            <w:r>
+              <w:rPr>
+                <w:sz w:val="18"/>
+              </w:rPr>
+              <w:t>−4 d</w:t>
+            </w:r>
+          </w:p>
+        </w:tc>
+        <w:tc>
+          <w:tcPr>
+            <w:tcW w:type="dxa" w:w="2160"/>
+          </w:tcPr>
+          <w:p>
+            <w:pPr>
+              <w:spacing w:after="0"/>
+            </w:pPr>
+            <w:r>
+              <w:rPr>
+                <w:sz w:val="18"/>
+              </w:rPr>
+              <w:t>Redactada; pendiente de aprobación del docente</w:t>
+            </w:r>
+          </w:p>
+        </w:tc>
+      </w:tr>
     </w:tbl>
     <w:p>
       <w:pPr>
@@ -3090,10 +3296,11 @@
         <w:rPr>
           <w:b/>
         </w:rPr>
-        <w:t xml:space="preserve">Resumen. </w:t>
+        <w:t>Resumen.</w:t>
       </w:r>
       <w:r>
-        <w:t>Al 23/09 están terminados 19 de los 21 paquetes de la EDT: 13 con atraso y 6 adelantados. Los paquetes del Sprint 1 cerraron con un atraso promedio de 9,2 días corridos. Los ocho planificados para el Sprint 2 que ya cerraron lo hicieron con un adelanto promedio de 1,9 días. Quedan abiertos 1.6 (pruebas responsive, 01/10) y 4.6 (este control, que se cierra junto con 1.6). Fuera de la EDT, la carpeta integradora del Sprint 1 se entregó el 23/09, con 12 días de atraso.</w:t>
+        <w:rPr/>
+        <w:t xml:space="preserve"> Al 28/09 están terminados los 21 paquetes de la EDT: 13 con atraso y 8 adelantados. Los paquetes del Sprint 1 cerraron con un atraso promedio de 9,2 días corridos. Los diez planificados para el Sprint 2 cerraron con un adelanto promedio de 2,3 días. Fuera de la EDT, la carpeta integradora del Sprint 1 se entregó con 12 días de atraso. Las imágenes de producto no llegaron a su fecha y se cerraron con la contingencia del riesgo R6. La solicitud de cambio de alcance (riesgo R4) quedó redactada y espera la aprobación del docente.</w:t>
       </w:r>
     </w:p>
     <w:p>
@@ -4006,13 +4213,11 @@
         <w:rPr>
           <w:b/>
         </w:rPr>
-        <w:t xml:space="preserve">Camino crítico. </w:t>
+        <w:t>Camino crítico.</w:t>
       </w:r>
       <w:r>
-        <w:t>La cadena 1.2 → 1.3 → 1.4 → 1.6 es el camino crítico del proyecto: es la de mayor duración encadenada y termina en la entrega del sitio. En ella se produjo el mayor desvío del período (+18 días en el repositorio), que arrastró al HTML5 semántico (+11 días).</w:t>
-      </w:r>
-      <w:r>
-        <w:t xml:space="preserve"> Al 23/09 la cadena está completa salvo 1.6, que ahora depende también de las imágenes de producto (riesgo R6): sin ellas, las pruebas no reflejarían el sitio real.</w:t>
+        <w:rPr/>
+        <w:t xml:space="preserve"> La cadena 1.2 → 1.3 → 1.4 → 1.6 es el camino crítico del proyecto: es la de mayor duración encadenada y termina en la entrega del sitio. En ella se produjo el mayor desvío del período (+18 días en el repositorio), que arrastró al HTML5 semántico (+11 días). La cadena se completó el 28/09 con las pruebas responsive, 4 días antes de lo planificado. La dependencia de 1.6 con las imágenes de producto (R6) se resolvió con la contingencia: las pruebas se hicieron sobre las láminas de color, que es lo que el sitio muestra en la entrega. Encontraron seis defectos de maquetación, que se corrigieron y verificaron el mismo día.</w:t>
       </w:r>
     </w:p>
     <w:p>
@@ -4524,6 +4729,112 @@
             <w:pPr>
               <w:spacing w:after="0"/>
             </w:pPr>
+            <w:r>
+              <w:rPr>
+                <w:sz w:val="18"/>
+              </w:rPr>
+              <w:t>−4 días, cerrados el 28/09</w:t>
+            </w:r>
+          </w:p>
+        </w:tc>
+        <w:tc>
+          <w:tcPr>
+            <w:tcW w:type="dxa" w:w="1440"/>
+          </w:tcPr>
+          <w:p>
+            <w:pPr>
+              <w:spacing w:after="0"/>
+            </w:pPr>
+            <w:r>
+              <w:rPr>
+                <w:sz w:val="18"/>
+              </w:rPr>
+              <w:t>1.6, 4.6</w:t>
+            </w:r>
+          </w:p>
+        </w:tc>
+        <w:tc>
+          <w:tcPr>
+            <w:tcW w:type="dxa" w:w="5616"/>
+          </w:tcPr>
+          <w:p>
+            <w:pPr>
+              <w:spacing w:after="0"/>
+            </w:pPr>
+            <w:r>
+              <w:rPr>
+                <w:sz w:val="18"/>
+              </w:rPr>
+              <w:t>Las pruebas se automatizaron con un script que recorre 22 combinaciones de página y ancho de pantalla, lo que permitió probar, corregir y volver a probar en el mismo día.</w:t>
+            </w:r>
+          </w:p>
+        </w:tc>
+      </w:tr>
+      <w:tr>
+        <w:trPr>
+          <w:cantSplit w:val="true"/>
+        </w:trPr>
+        <w:tc>
+          <w:tcPr>
+            <w:tcW w:type="dxa" w:w="2304"/>
+          </w:tcPr>
+          <w:p>
+            <w:pPr>
+              <w:spacing w:after="0"/>
+            </w:pPr>
+            <w:r>
+              <w:rPr>
+                <w:sz w:val="18"/>
+              </w:rPr>
+              <w:t>Sin entrega en fecha (contingencia)</w:t>
+            </w:r>
+          </w:p>
+        </w:tc>
+        <w:tc>
+          <w:tcPr>
+            <w:tcW w:type="dxa" w:w="1440"/>
+          </w:tcPr>
+          <w:p>
+            <w:pPr>
+              <w:spacing w:after="0"/>
+            </w:pPr>
+            <w:r>
+              <w:rPr>
+                <w:sz w:val="18"/>
+              </w:rPr>
+              <w:t>Imágenes de producto</w:t>
+            </w:r>
+          </w:p>
+        </w:tc>
+        <w:tc>
+          <w:tcPr>
+            <w:tcW w:type="dxa" w:w="5616"/>
+          </w:tcPr>
+          <w:p>
+            <w:pPr>
+              <w:spacing w:after="0"/>
+            </w:pPr>
+            <w:r>
+              <w:rPr>
+                <w:sz w:val="18"/>
+              </w:rPr>
+              <w:t>Tarea exigida por la consigna que no tenía paquete en la EDT ni tarjeta en el Kanban, solo un riesgo en la matriz: la misma causa que 3.5 y la carpeta integradora.</w:t>
+            </w:r>
+          </w:p>
+        </w:tc>
+      </w:tr>
+      <w:tr>
+        <w:trPr>
+          <w:cantSplit w:val="true"/>
+        </w:trPr>
+        <w:tc>
+          <w:tcPr>
+            <w:tcW w:type="dxa" w:w="2304"/>
+          </w:tcPr>
+          <w:p>
+            <w:pPr>
+              <w:spacing w:after="0"/>
+            </w:pPr>
             <w:r/>
             <w:r>
               <w:rPr>
@@ -4661,6 +4972,22 @@
       </w:r>
       <w:r>
         <w:t>El 02/10 queda reservado para integración y revisión final; ningún paquete nuevo se planifica para ese día.</w:t>
+      </w:r>
+    </w:p>
+    <w:p>
+      <w:pPr>
+        <w:pStyle w:val="ListBullet"/>
+        <w:spacing w:after="60"/>
+      </w:pPr>
+      <w:r>
+        <w:rPr>
+          <w:b/>
+        </w:rPr>
+        <w:t>Aplicación de contingencias planificadas.</w:t>
+      </w:r>
+      <w:r>
+        <w:rPr/>
+        <w:t xml:space="preserve"> Las imágenes de producto no llegaron a la fecha comprometida. Se aplicó la contingencia prevista en la matriz de riesgos (láminas de color con el sello «Imagen con IA») y así 1.6 no quedó bloqueado. La generación de las imágenes pasa al Sprint 3 como tarea propia.</w:t>
       </w:r>
     </w:p>
     <w:p>
@@ -5312,7 +5639,7 @@
               <w:rPr>
                 <w:sz w:val="18"/>
               </w:rPr>
-              <w:t>29/09 · pendiente</w:t>
+              <w:t>29/09 · contingencia aplicada el 28/09 (pasa al Sprint 3)</w:t>
             </w:r>
           </w:p>
         </w:tc>
@@ -5391,7 +5718,7 @@
               <w:rPr>
                 <w:sz w:val="18"/>
               </w:rPr>
-              <w:t>01/10 · pendiente</w:t>
+              <w:t>01/10 · hecho el 28/09 (22 de 22 combinaciones)</w:t>
             </w:r>
           </w:p>
         </w:tc>
@@ -5408,7 +5735,7 @@
               <w:rPr>
                 <w:sz w:val="18"/>
               </w:rPr>
-              <w:t>1.4 e imágenes (R6)</w:t>
+              <w:t>1.4 y contingencia de R6</w:t>
             </w:r>
           </w:p>
         </w:tc>
@@ -5470,7 +5797,7 @@
               <w:rPr>
                 <w:sz w:val="18"/>
               </w:rPr>
-              <w:t>01/10 · en curso (este control)</w:t>
+              <w:t>01/10 · hecho el 28/09 (este control)</w:t>
             </w:r>
           </w:p>
         </w:tc>
@@ -5490,6 +5817,156 @@
                 <w:sz w:val="18"/>
               </w:rPr>
               <w:t>Todos</w:t>
+            </w:r>
+          </w:p>
+        </w:tc>
+      </w:tr>
+      <w:tr>
+        <w:trPr>
+          <w:cantSplit w:val="true"/>
+        </w:trPr>
+        <w:tc>
+          <w:tcPr>
+            <w:tcW w:type="dxa" w:w="737"/>
+          </w:tcPr>
+          <w:p>
+            <w:pPr>
+              <w:keepNext/>
+              <w:spacing w:after="0"/>
+              <w:jc w:val="center"/>
+            </w:pPr>
+            <w:r>
+              <w:rPr>
+                <w:sz w:val="18"/>
+              </w:rPr>
+              <w:t>—</w:t>
+            </w:r>
+          </w:p>
+        </w:tc>
+        <w:tc>
+          <w:tcPr>
+            <w:tcW w:type="dxa" w:w="4365"/>
+          </w:tcPr>
+          <w:p>
+            <w:pPr>
+              <w:keepNext/>
+              <w:spacing w:after="0"/>
+            </w:pPr>
+            <w:r>
+              <w:rPr>
+                <w:sz w:val="18"/>
+              </w:rPr>
+              <w:t>Solicitud de cambio de alcance del Acta (riesgo R4)</w:t>
+            </w:r>
+          </w:p>
+        </w:tc>
+        <w:tc>
+          <w:tcPr>
+            <w:tcW w:type="dxa" w:w="2268"/>
+          </w:tcPr>
+          <w:p>
+            <w:pPr>
+              <w:keepNext/>
+              <w:spacing w:after="0"/>
+              <w:jc w:val="center"/>
+            </w:pPr>
+            <w:r>
+              <w:rPr>
+                <w:sz w:val="18"/>
+              </w:rPr>
+              <w:t>02/10 · redactada el 28/09, pendiente de aprobación del docente</w:t>
+            </w:r>
+          </w:p>
+        </w:tc>
+        <w:tc>
+          <w:tcPr>
+            <w:tcW w:type="dxa" w:w="1701"/>
+          </w:tcPr>
+          <w:p>
+            <w:pPr>
+              <w:keepNext/>
+              <w:spacing w:after="0"/>
+            </w:pPr>
+            <w:r>
+              <w:rPr>
+                <w:sz w:val="18"/>
+              </w:rPr>
+              <w:t>—</w:t>
+            </w:r>
+          </w:p>
+        </w:tc>
+      </w:tr>
+      <w:tr>
+        <w:trPr>
+          <w:cantSplit w:val="true"/>
+        </w:trPr>
+        <w:tc>
+          <w:tcPr>
+            <w:tcW w:type="dxa" w:w="737"/>
+          </w:tcPr>
+          <w:p>
+            <w:pPr>
+              <w:keepNext/>
+              <w:spacing w:after="0"/>
+              <w:jc w:val="center"/>
+            </w:pPr>
+            <w:r>
+              <w:rPr>
+                <w:sz w:val="18"/>
+              </w:rPr>
+              <w:t>—</w:t>
+            </w:r>
+          </w:p>
+        </w:tc>
+        <w:tc>
+          <w:tcPr>
+            <w:tcW w:type="dxa" w:w="4365"/>
+          </w:tcPr>
+          <w:p>
+            <w:pPr>
+              <w:keepNext/>
+              <w:spacing w:after="0"/>
+            </w:pPr>
+            <w:r>
+              <w:rPr>
+                <w:sz w:val="18"/>
+              </w:rPr>
+              <w:t>Prueba del sitio en un teléfono real (riesgo R7)</w:t>
+            </w:r>
+          </w:p>
+        </w:tc>
+        <w:tc>
+          <w:tcPr>
+            <w:tcW w:type="dxa" w:w="2268"/>
+          </w:tcPr>
+          <w:p>
+            <w:pPr>
+              <w:keepNext/>
+              <w:spacing w:after="0"/>
+              <w:jc w:val="center"/>
+            </w:pPr>
+            <w:r>
+              <w:rPr>
+                <w:sz w:val="18"/>
+              </w:rPr>
+              <w:t>01/10 · pendiente</w:t>
+            </w:r>
+          </w:p>
+        </w:tc>
+        <w:tc>
+          <w:tcPr>
+            <w:tcW w:type="dxa" w:w="1701"/>
+          </w:tcPr>
+          <w:p>
+            <w:pPr>
+              <w:keepNext/>
+              <w:spacing w:after="0"/>
+            </w:pPr>
+            <w:r>
+              <w:rPr>
+                <w:sz w:val="18"/>
+              </w:rPr>
+              <w:t>1.6</w:t>
             </w:r>
           </w:p>
         </w:tc>
@@ -5590,7 +6067,7 @@
         <w:jc w:val="both"/>
       </w:pPr>
       <w:r>
-        <w:t>El Sprint 1 cerró con atrasos generalizados, originados en la acumulación de trabajo hacia las fechas de corrección y en un repositorio que quedó sin inicializar dentro del camino crítico. El Sprint 2 revirtió esa tendencia: el fast tracking recuperó primero el camino crítico y después las ramas Legal y Negocio, y los ocho paquetes del Sprint 2 ya cerrados lo hicieron en promedio 1,9 días antes de lo planificado. Al corte del 23/09, el riesgo de la entrega del 02/10 se concentra en un solo punto: las imágenes de producto, que condicionan las pruebas responsive.</w:t>
+        <w:t>El Sprint 1 cerró con atrasos generalizados, originados en la acumulación de trabajo hacia las fechas de corrección y en un repositorio que quedó sin inicializar dentro del camino crítico. El Sprint 2 revirtió esa tendencia: el fast tracking recuperó primero el camino crítico y después las ramas Legal y Negocio, y los diez paquetes del Sprint 2 cerraron en promedio 2,3 días antes de lo planificado. Al 28/09 los 21 paquetes de la EDT están terminados. Para la entrega del 02/10 quedan dos acciones fuera de la EDT: la aprobación de la solicitud de cambio por parte del docente y la prueba del sitio en un teléfono real. El 02/10 se mantiene como colchón para armar el portafolio.</w:t>
       </w:r>
     </w:p>
     <w:p>
@@ -5641,6 +6118,36 @@
       </w:r>
       <w:r>
         <w:t>El atraso del Sprint 1 no se recuperó trabajando más horas, sino ordenando las tareas por dependencia y cerrando el camino crítico primero.</w:t>
+      </w:r>
+    </w:p>
+    <w:p>
+      <w:pPr>
+        <w:pStyle w:val="ListBullet"/>
+      </w:pPr>
+      <w:r>
+        <w:rPr>
+          <w:b/>
+        </w:rPr>
+        <w:t>Una contingencia escrita a tiempo evita un bloqueo.</w:t>
+      </w:r>
+      <w:r>
+        <w:rPr/>
+        <w:t xml:space="preserve"> Las imágenes de producto no llegaron, pero la matriz de riesgos ya tenía definida la alternativa. Aplicarla llevó minutos y el camino crítico no se detuvo.</w:t>
+      </w:r>
+    </w:p>
+    <w:p>
+      <w:pPr>
+        <w:pStyle w:val="ListBullet"/>
+      </w:pPr>
+      <w:r>
+        <w:rPr>
+          <w:b/>
+        </w:rPr>
+        <w:t>Medir no reemplaza mirar.</w:t>
+      </w:r>
+      <w:r>
+        <w:rPr/>
+        <w:t xml:space="preserve"> Las pruebas automáticas no detectaron que el carrito ocupaba el 65 % del ancho en celular: apareció al revisar las capturas. Todo control de avance combina métricas con una revisión visual de la evidencia.</w:t>
       </w:r>
     </w:p>
     <w:sectPr>

</xml_diff>